<commit_message>
fix(transparencia): 4o gatilho (consentimento, Lei 14.874/LGPD) e enxugo da dica 2.10
- Pagina de Transparencia: card novo 'Eliminatoria — novo consentimento' (Gatilho 4); card 3 escopado a cadeia de custodia (Res. 738); narrativa tres->quatro mecanismos; grid 2x4
- data.ts: remove nota de terminologia redundante no fim da dica da 2.10 (sem mudanca de logica/pontuacao)
- Suplemento de Salvaguardas (.docx): Tabela 1 com 4a linha, secao das eliminatorias cobrindo custodia + consentimento, contagens e sintese atualizadas
- verify-math 46/0; sem novos erros de tsc/eslint nos arquivos tocados
</commit_message>
<xml_diff>
--- a/public/suplemento-salvaguardas-maria.docx
+++ b/public/suplemento-salvaguardas-maria.docx
@@ -64,7 +64,7 @@
           <w:sz w:val="24"/>
           <w:szCs w:val="24"/>
         </w:rPr>
-        <w:t>MARIA Matriz de Avaliação de Risco em Inteligência Artificial · Versão preliminar · Junho de 2026</w:t>
+        <w:t>MARIA Matriz de Avaliação de Risco em Inteligência Artificial · Versão preliminar · Julho de 2026</w:t>
       </w:r>
     </w:p>
     <w:p>
@@ -85,7 +85,7 @@
           <w:sz w:val="24"/>
           <w:szCs w:val="24"/>
         </w:rPr>
-        <w:t>Este suplemento explica os três mecanismos de salvaguarda automática da MARIA, que ignoram a lógica de gradiente do instrumento e forçam a elevação ou recusa da classificação com base em uma condição categórica. O texto é técnico dirigido às e aos integrantes do Grupo de Trabalho, e pode ser lido isoladamente ou inserido como seção da Nota Técnica de Premissas. Ele amplia a versão anterior, que cobria apenas o gatilho do Eixo 3.b.</w:t>
+        <w:t>Este suplemento explica os quatro mecanismos de salvaguarda automática da MARIA, que ignoram a lógica de gradiente do instrumento e forçam a elevação ou recusa da classificação com base em uma condição categórica. O texto é técnico dirigido às e aos integrantes do Grupo de Trabalho, e pode ser lido isoladamente ou inserido como seção da Nota Técnica de Premissas. Ele amplia a versão anterior, que cobria apenas o gatilho do Eixo 3.b.</w:t>
       </w:r>
     </w:p>
     <w:p>
@@ -127,23 +127,7 @@
           <w:sz w:val="24"/>
           <w:szCs w:val="24"/>
         </w:rPr>
-        <w:t>Em ambas as versões, a MARIA parte de uma lógica de gradiente: o risco do protocolo cresce de forma incremental, seja com o número de respostas de risco por eixo (Versão A), seja com a soma de pontos entre blocos (Versão B). Sobre essa lógica gradiente, a matriz superpõe três mecanismos que a interrompem: uma vez satisfeita determinada condição, a classificação é definida por critério deontológico</w:t>
-      </w:r>
-      <w:r>
-        <w:rPr>
-          <w:rFonts w:ascii="Times New Roman" w:hAnsi="Times New Roman" w:cs="Times New Roman"/>
-          <w:sz w:val="24"/>
-          <w:szCs w:val="24"/>
-        </w:rPr>
-        <w:t>, e</w:t>
-      </w:r>
-      <w:r>
-        <w:rPr>
-          <w:rFonts w:ascii="Times New Roman" w:hAnsi="Times New Roman" w:cs="Times New Roman"/>
-          <w:sz w:val="24"/>
-          <w:szCs w:val="24"/>
-        </w:rPr>
-        <w:t xml:space="preserve"> não estatístico, sobrescrevendo o que a contagem ou a soma indicariam.</w:t>
+        <w:t xml:space="preserve">Em ambas as versões, a MARIA parte de uma lógica de gradiente: o risco do protocolo cresce de forma incremental, seja com o número de respostas de risco por eixo (Versão A), seja com a soma de pontos entre blocos (Versão B). Sobre essa lógica gradiente, a matriz superpõe quatro mecanismos que a interrompem: uma vez satisfeita determinada condição, a classificação é definida por critério deontológico, e não estatístico, sobrescrevendo o que a contagem ou a soma indicariam.</w:t>
       </w:r>
     </w:p>
     <w:p>
@@ -164,31 +148,7 @@
           <w:sz w:val="24"/>
           <w:szCs w:val="24"/>
         </w:rPr>
-        <w:t>A razão é substantiva</w:t>
-      </w:r>
-      <w:r>
-        <w:rPr>
-          <w:rFonts w:ascii="Times New Roman" w:hAnsi="Times New Roman" w:cs="Times New Roman"/>
-          <w:sz w:val="24"/>
-          <w:szCs w:val="24"/>
-        </w:rPr>
-        <w:t>, porque c</w:t>
-      </w:r>
-      <w:r>
-        <w:rPr>
-          <w:rFonts w:ascii="Times New Roman" w:hAnsi="Times New Roman" w:cs="Times New Roman"/>
-          <w:sz w:val="24"/>
-          <w:szCs w:val="24"/>
-        </w:rPr>
-        <w:t>ertas condições éticas não se manifestam em gradiente: a sua simples presença já é decisiva.</w:t>
-      </w:r>
-      <w:r>
-        <w:rPr>
-          <w:rFonts w:ascii="Times New Roman" w:hAnsi="Times New Roman" w:cs="Times New Roman"/>
-          <w:sz w:val="24"/>
-          <w:szCs w:val="24"/>
-        </w:rPr>
-        <w:t xml:space="preserve"> </w:t>
+        <w:t xml:space="preserve">A razão é substantiva, porque certas condições éticas não se manifestam em gradiente: a sua simples presença já é decisiva. </w:t>
       </w:r>
       <w:r>
         <w:rPr>
@@ -205,7 +165,7 @@
           <w:sz w:val="24"/>
           <w:szCs w:val="24"/>
         </w:rPr>
-        <w:t xml:space="preserve"> Tratar essas condições pela média ou pela soma as diluiria em escores agregados, justamente onde o instrumento precisa ser mais sensível. Os três gatilhos são, portanto, salvaguardas de precaução: assimetrias assumidas como tais, que preferem classificar a mais a deixar passar a menos.</w:t>
+        <w:t xml:space="preserve"> Tratar essas condições pela média ou pela soma as diluiria em escores agregados, justamente onde o instrumento precisa ser mais sensível. Os quatro gatilhos são, portanto, salvaguardas de precaução: assimetrias assumidas como tais, que preferem classificar a mais a deixar passar a menos.</w:t>
       </w:r>
     </w:p>
     <w:p>
@@ -226,39 +186,7 @@
           <w:sz w:val="24"/>
           <w:szCs w:val="24"/>
         </w:rPr>
-        <w:t xml:space="preserve">Os três mecanismos compartilham a mesma estrutura </w:t>
-      </w:r>
-      <w:r>
-        <w:rPr>
-          <w:rFonts w:ascii="Times New Roman" w:hAnsi="Times New Roman" w:cs="Times New Roman"/>
-          <w:sz w:val="24"/>
-          <w:szCs w:val="24"/>
-        </w:rPr>
-        <w:t>(</w:t>
-      </w:r>
-      <w:r>
-        <w:rPr>
-          <w:rFonts w:ascii="Times New Roman" w:hAnsi="Times New Roman" w:cs="Times New Roman"/>
-          <w:sz w:val="24"/>
-          <w:szCs w:val="24"/>
-        </w:rPr>
-        <w:t>uma condição categórica que, uma vez atendida, prevalece sobre o gradiente</w:t>
-      </w:r>
-      <w:r>
-        <w:rPr>
-          <w:rFonts w:ascii="Times New Roman" w:hAnsi="Times New Roman" w:cs="Times New Roman"/>
-          <w:sz w:val="24"/>
-          <w:szCs w:val="24"/>
-        </w:rPr>
-        <w:t>),</w:t>
-      </w:r>
-      <w:r>
-        <w:rPr>
-          <w:rFonts w:ascii="Times New Roman" w:hAnsi="Times New Roman" w:cs="Times New Roman"/>
-          <w:sz w:val="24"/>
-          <w:szCs w:val="24"/>
-        </w:rPr>
-        <w:t xml:space="preserve"> mas atuam em pontos distintos do instrumento, conforme a Tabela 1.</w:t>
+        <w:t xml:space="preserve">Os quatro mecanismos compartilham a mesma estrutura (uma condição categórica que, uma vez atendida, prevalece sobre o gradiente), mas atuam em pontos distintos do instrumento, conforme a Tabela 1.</w:t>
       </w:r>
     </w:p>
     <w:p>
@@ -357,7 +285,7 @@
           <w:sz w:val="24"/>
           <w:szCs w:val="24"/>
         </w:rPr>
-        <w:t>Tabela 1 Visão geral dos três gatilhos de salvaguarda</w:t>
+        <w:t>Tabela 1 Visão geral dos quatro gatilhos de salvaguarda</w:t>
       </w:r>
     </w:p>
     <w:tbl>
@@ -882,7 +810,7 @@
                 <w:sz w:val="24"/>
                 <w:szCs w:val="24"/>
               </w:rPr>
-              <w:t>3. Questões eliminatórias (Salvaguarda de Inavaliabilidade)</w:t>
+              <w:t>3. Eliminatória de cadeia de custódia (Salvaguarda de Inavaliabilidade — Res. 738/2024)</w:t>
             </w:r>
           </w:p>
         </w:tc>
@@ -956,7 +884,157 @@
                 <w:sz w:val="24"/>
                 <w:szCs w:val="24"/>
               </w:rPr>
-              <w:t>Acionamento de questão eliminatória</w:t>
+              <w:t>Ausência de cadeia de custódia formalizada dos dados</w:t>
+            </w:r>
+          </w:p>
+        </w:tc>
+        <w:tc>
+          <w:tcPr>
+            <w:tcW w:w="2639" w:type="dxa"/>
+            <w:tcBorders>
+              <w:top w:val="single" w:sz="1" w:space="0" w:color="CCCCCC"/>
+              <w:left w:val="single" w:sz="1" w:space="0" w:color="CCCCCC"/>
+              <w:bottom w:val="single" w:sz="1" w:space="0" w:color="CCCCCC"/>
+              <w:right w:val="single" w:sz="1" w:space="0" w:color="CCCCCC"/>
+            </w:tcBorders>
+            <w:tcMar>
+              <w:top w:w="60" w:type="dxa"/>
+              <w:left w:w="110" w:type="dxa"/>
+              <w:bottom w:w="60" w:type="dxa"/>
+              <w:right w:w="110" w:type="dxa"/>
+            </w:tcMar>
+          </w:tcPr>
+          <w:p>
+            <w:pPr>
+              <w:spacing w:line="360" w:lineRule="auto"/>
+              <w:contextualSpacing/>
+              <w:jc w:val="both"/>
+              <w:rPr>
+                <w:rFonts w:ascii="Times New Roman" w:hAnsi="Times New Roman" w:cs="Times New Roman"/>
+                <w:sz w:val="24"/>
+                <w:szCs w:val="24"/>
+              </w:rPr>
+            </w:pPr>
+            <w:r>
+              <w:rPr>
+                <w:rFonts w:ascii="Times New Roman" w:hAnsi="Times New Roman" w:cs="Times New Roman"/>
+                <w:sz w:val="24"/>
+                <w:szCs w:val="24"/>
+              </w:rPr>
+              <w:t>Classifica o protocolo como “não avaliável pela MARIA”</w:t>
+            </w:r>
+          </w:p>
+        </w:tc>
+      </w:tr>
+      <w:tr>
+        <w:tc>
+          <w:tcPr>
+            <w:tcW w:w="2508" w:type="dxa"/>
+            <w:tcBorders>
+              <w:top w:val="single" w:sz="1" w:space="0" w:color="CCCCCC"/>
+              <w:left w:val="single" w:sz="1" w:space="0" w:color="CCCCCC"/>
+              <w:bottom w:val="single" w:sz="1" w:space="0" w:color="CCCCCC"/>
+              <w:right w:val="single" w:sz="1" w:space="0" w:color="CCCCCC"/>
+            </w:tcBorders>
+            <w:tcMar>
+              <w:top w:w="60" w:type="dxa"/>
+              <w:left w:w="110" w:type="dxa"/>
+              <w:bottom w:w="60" w:type="dxa"/>
+              <w:right w:w="110" w:type="dxa"/>
+            </w:tcMar>
+          </w:tcPr>
+          <w:p>
+            <w:pPr>
+              <w:spacing w:line="360" w:lineRule="auto"/>
+              <w:contextualSpacing/>
+              <w:jc w:val="both"/>
+              <w:rPr>
+                <w:rFonts w:ascii="Times New Roman" w:hAnsi="Times New Roman" w:cs="Times New Roman"/>
+                <w:sz w:val="24"/>
+                <w:szCs w:val="24"/>
+              </w:rPr>
+            </w:pPr>
+            <w:r>
+              <w:rPr>
+                <w:rFonts w:ascii="Times New Roman" w:hAnsi="Times New Roman" w:cs="Times New Roman"/>
+                <w:sz w:val="24"/>
+                <w:szCs w:val="24"/>
+              </w:rPr>
+              <w:t>4. Diligência impeditiva de novo consentimento (Lei 14.874/2024 + LGPD)</w:t>
+            </w:r>
+          </w:p>
+        </w:tc>
+        <w:tc>
+          <w:tcPr>
+            <w:tcW w:w="1513" w:type="dxa"/>
+            <w:tcBorders>
+              <w:top w:val="single" w:sz="1" w:space="0" w:color="CCCCCC"/>
+              <w:left w:val="single" w:sz="1" w:space="0" w:color="CCCCCC"/>
+              <w:bottom w:val="single" w:sz="1" w:space="0" w:color="CCCCCC"/>
+              <w:right w:val="single" w:sz="1" w:space="0" w:color="CCCCCC"/>
+            </w:tcBorders>
+            <w:tcMar>
+              <w:top w:w="60" w:type="dxa"/>
+              <w:left w:w="110" w:type="dxa"/>
+              <w:bottom w:w="60" w:type="dxa"/>
+              <w:right w:w="110" w:type="dxa"/>
+            </w:tcMar>
+          </w:tcPr>
+          <w:p>
+            <w:pPr>
+              <w:spacing w:line="360" w:lineRule="auto"/>
+              <w:contextualSpacing/>
+              <w:jc w:val="both"/>
+              <w:rPr>
+                <w:rFonts w:ascii="Times New Roman" w:hAnsi="Times New Roman" w:cs="Times New Roman"/>
+                <w:sz w:val="24"/>
+                <w:szCs w:val="24"/>
+              </w:rPr>
+            </w:pPr>
+            <w:r>
+              <w:rPr>
+                <w:rFonts w:ascii="Times New Roman" w:hAnsi="Times New Roman" w:cs="Times New Roman"/>
+                <w:sz w:val="24"/>
+                <w:szCs w:val="24"/>
+              </w:rPr>
+              <w:t>A e B</w:t>
+            </w:r>
+          </w:p>
+        </w:tc>
+        <w:tc>
+          <w:tcPr>
+            <w:tcW w:w="2366" w:type="dxa"/>
+            <w:tcBorders>
+              <w:top w:val="single" w:sz="1" w:space="0" w:color="CCCCCC"/>
+              <w:left w:val="single" w:sz="1" w:space="0" w:color="CCCCCC"/>
+              <w:bottom w:val="single" w:sz="1" w:space="0" w:color="CCCCCC"/>
+              <w:right w:val="single" w:sz="1" w:space="0" w:color="CCCCCC"/>
+            </w:tcBorders>
+            <w:tcMar>
+              <w:top w:w="60" w:type="dxa"/>
+              <w:left w:w="110" w:type="dxa"/>
+              <w:bottom w:w="60" w:type="dxa"/>
+              <w:right w:w="110" w:type="dxa"/>
+            </w:tcMar>
+          </w:tcPr>
+          <w:p>
+            <w:pPr>
+              <w:spacing w:line="360" w:lineRule="auto"/>
+              <w:contextualSpacing/>
+              <w:jc w:val="both"/>
+              <w:rPr>
+                <w:rFonts w:ascii="Times New Roman" w:hAnsi="Times New Roman" w:cs="Times New Roman"/>
+                <w:sz w:val="24"/>
+                <w:szCs w:val="24"/>
+              </w:rPr>
+            </w:pPr>
+            <w:r>
+              <w:rPr>
+                <w:rFonts w:ascii="Times New Roman" w:hAnsi="Times New Roman" w:cs="Times New Roman"/>
+                <w:sz w:val="24"/>
+                <w:szCs w:val="24"/>
+              </w:rPr>
+              <w:t>Sistema adaptativo (1.2 / P2.2 = Sim) sem plano de novo consentimento</w:t>
             </w:r>
           </w:p>
         </w:tc>
@@ -1010,7 +1088,7 @@
           <w:i/>
           <w:sz w:val="24"/>
         </w:rPr>
-        <w:t>As seções seguintes detalham cada gatilho. Os dois primeiros recebem tratamento completo: o que faz, por que faz, como interage com a matriz, cenários e crítica honesta. O terceiro, por ser uma saída categorial distinta, é apresentado em parágrafo.</w:t>
+        <w:t>As seções seguintes detalham cada gatilho. Os dois primeiros recebem tratamento completo: o que faz, por que faz, como interage com a matriz, cenários e crítica honesta. Os dois últimos, por serem saídas categoriais distintas, são apresentados em conjunto.</w:t>
       </w:r>
     </w:p>
     <w:p>
@@ -1976,23 +2054,7 @@
           <w:sz w:val="24"/>
           <w:szCs w:val="24"/>
         </w:rPr>
-        <w:t>2.2 Por que essa diferença</w:t>
-      </w:r>
-      <w:r>
-        <w:rPr>
-          <w:rFonts w:ascii="Times New Roman" w:hAnsi="Times New Roman" w:cs="Times New Roman"/>
-          <w:sz w:val="24"/>
-          <w:szCs w:val="24"/>
-        </w:rPr>
-        <w:t>:</w:t>
-      </w:r>
-      <w:r>
-        <w:rPr>
-          <w:rFonts w:ascii="Times New Roman" w:hAnsi="Times New Roman" w:cs="Times New Roman"/>
-          <w:sz w:val="24"/>
-          <w:szCs w:val="24"/>
-        </w:rPr>
-        <w:t xml:space="preserve"> o argumento substantivo</w:t>
+        <w:t xml:space="preserve">2.2 Por que essa diferença: o argumento substantivo</w:t>
       </w:r>
     </w:p>
     <w:p>
@@ -2159,30 +2221,7 @@
           <w:sz w:val="24"/>
           <w:szCs w:val="24"/>
         </w:rPr>
-        <w:t>Esses riscos têm uma característica que justifica a regra excepcional: eles não se manifestam em gradiente. Ou o banco está sendo manejado dentro dos requisitos da Res. 738 (zero problema, risco baixo), ou há um problema concreto</w:t>
-      </w:r>
-      <w:r>
-        <w:rPr>
-          <w:rFonts w:ascii="Times New Roman" w:hAnsi="Times New Roman" w:cs="Times New Roman"/>
-          <w:sz w:val="24"/>
-          <w:szCs w:val="24"/>
-        </w:rPr>
-        <w:t>;</w:t>
-      </w:r>
-      <w:r>
-        <w:rPr>
-          <w:rFonts w:ascii="Times New Roman" w:hAnsi="Times New Roman" w:cs="Times New Roman"/>
-          <w:sz w:val="24"/>
-          <w:szCs w:val="24"/>
-        </w:rPr>
-        <w:t xml:space="preserve"> e quando há, o risco já é elevado, </w:t>
-      </w:r>
-      <w:r>
-        <w:rPr>
-          <w:rFonts w:ascii="Times New Roman" w:hAnsi="Times New Roman" w:cs="Times New Roman"/>
-          <w:sz w:val="24"/>
-          <w:szCs w:val="24"/>
-        </w:rPr>
+        <w:t xml:space="preserve">Esses riscos têm uma característica que justifica a regra excepcional: eles não se manifestam em gradiente. Ou o banco está sendo manejado dentro dos requisitos da Res. 738 (zero problema, risco baixo), ou há um problema concreto; e quando há, o risco já é elevado, </w:t>
         <w:lastRenderedPageBreak/>
         <w:t>porque os danos potenciais (vazamento, re-identificação, uso secundário não consentido) não admitem categoria moderada. Não existe, na prática, “violação moderada de confidencialidade” ou “consentimento parcialmente válido”. A categoria intermediária (“moderado”) não faz sentido analítico para esse domínio.</w:t>
       </w:r>
@@ -2264,39 +2303,7 @@
           <w:sz w:val="24"/>
           <w:szCs w:val="24"/>
         </w:rPr>
-        <w:t>Se o Eixo 3.b retorna Nível I, ele não eleva nada</w:t>
-      </w:r>
-      <w:r>
-        <w:rPr>
-          <w:rFonts w:ascii="Times New Roman" w:hAnsi="Times New Roman" w:cs="Times New Roman"/>
-          <w:sz w:val="24"/>
-          <w:szCs w:val="24"/>
-        </w:rPr>
-        <w:t>.</w:t>
-      </w:r>
-      <w:r>
-        <w:rPr>
-          <w:rFonts w:ascii="Times New Roman" w:hAnsi="Times New Roman" w:cs="Times New Roman"/>
-          <w:sz w:val="24"/>
-          <w:szCs w:val="24"/>
-        </w:rPr>
-        <w:t xml:space="preserve"> </w:t>
-      </w:r>
-      <w:r>
-        <w:rPr>
-          <w:rFonts w:ascii="Times New Roman" w:hAnsi="Times New Roman" w:cs="Times New Roman"/>
-          <w:sz w:val="24"/>
-          <w:szCs w:val="24"/>
-        </w:rPr>
-        <w:t>O</w:t>
-      </w:r>
-      <w:r>
-        <w:rPr>
-          <w:rFonts w:ascii="Times New Roman" w:hAnsi="Times New Roman" w:cs="Times New Roman"/>
-          <w:sz w:val="24"/>
-          <w:szCs w:val="24"/>
-        </w:rPr>
-        <w:t>s demais eixos definem o nível final normalmente.</w:t>
+        <w:t xml:space="preserve">Se o Eixo 3.b retorna Nível I, ele não eleva nada. Os demais eixos definem o nível final normalmente.</w:t>
       </w:r>
     </w:p>
     <w:p>
@@ -2409,8 +2416,40 @@
           <w:sz w:val="24"/>
           <w:szCs w:val="24"/>
         </w:rPr>
-        <w:t>Cenário A</w:t>
-      </w:r>
+        <w:t xml:space="preserve">Cenário A: protocolo usa banco, em conformidade com a Res. 738.</w:t>
+      </w:r>
+    </w:p>
+    <w:p>
+      <w:pPr>
+        <w:spacing w:after="120" w:line="360" w:lineRule="auto"/>
+        <w:contextualSpacing/>
+        <w:jc w:val="both"/>
+        <w:rPr>
+          <w:rFonts w:ascii="Times New Roman" w:hAnsi="Times New Roman" w:cs="Times New Roman"/>
+          <w:sz w:val="24"/>
+          <w:szCs w:val="24"/>
+        </w:rPr>
+      </w:pPr>
+      <w:r>
+        <w:rPr>
+          <w:rFonts w:ascii="Times New Roman" w:hAnsi="Times New Roman" w:cs="Times New Roman"/>
+          <w:sz w:val="24"/>
+          <w:szCs w:val="24"/>
+        </w:rPr>
+        <w:t>Eixo 3.b: 0 respostas de risco → Nível I. O eixo não eleva a classificação. Os outros cinco eixos definem o nível final segundo a regra padrão.</w:t>
+      </w:r>
+    </w:p>
+    <w:p>
+      <w:pPr>
+        <w:spacing w:after="120" w:line="360" w:lineRule="auto"/>
+        <w:contextualSpacing/>
+        <w:jc w:val="both"/>
+        <w:rPr>
+          <w:rFonts w:ascii="Times New Roman" w:hAnsi="Times New Roman" w:cs="Times New Roman"/>
+          <w:sz w:val="24"/>
+          <w:szCs w:val="24"/>
+        </w:rPr>
+      </w:pPr>
       <w:r>
         <w:rPr>
           <w:rFonts w:ascii="Times New Roman" w:hAnsi="Times New Roman" w:cs="Times New Roman"/>
@@ -2419,8 +2458,40 @@
           <w:sz w:val="24"/>
           <w:szCs w:val="24"/>
         </w:rPr>
-        <w:t>:</w:t>
-      </w:r>
+        <w:t xml:space="preserve">Cenário B: protocolo usa banco, com 1 problema concreto.</w:t>
+      </w:r>
+    </w:p>
+    <w:p>
+      <w:pPr>
+        <w:spacing w:after="120" w:line="360" w:lineRule="auto"/>
+        <w:contextualSpacing/>
+        <w:jc w:val="both"/>
+        <w:rPr>
+          <w:rFonts w:ascii="Times New Roman" w:hAnsi="Times New Roman" w:cs="Times New Roman"/>
+          <w:sz w:val="24"/>
+          <w:szCs w:val="24"/>
+        </w:rPr>
+      </w:pPr>
+      <w:r>
+        <w:rPr>
+          <w:rFonts w:ascii="Times New Roman" w:hAnsi="Times New Roman" w:cs="Times New Roman"/>
+          <w:sz w:val="24"/>
+          <w:szCs w:val="24"/>
+        </w:rPr>
+        <w:t>Exemplo: dispensa de consentimento adotada sem justificativa adequada na perspectiva da Res. 738. Eixo 3.b: 1 resposta de risco → Nível III. Pela regra do máximo, o protocolo é classificado em pelo menos Nível III, ainda que os outros cinco eixos sejam todos Nível I. Um único problema no Eixo 3.b promove o protocolo dois níveis (do I direto ao III).</w:t>
+      </w:r>
+    </w:p>
+    <w:p>
+      <w:pPr>
+        <w:spacing w:after="120" w:line="360" w:lineRule="auto"/>
+        <w:contextualSpacing/>
+        <w:jc w:val="both"/>
+        <w:rPr>
+          <w:rFonts w:ascii="Times New Roman" w:hAnsi="Times New Roman" w:cs="Times New Roman"/>
+          <w:sz w:val="24"/>
+          <w:szCs w:val="24"/>
+        </w:rPr>
+      </w:pPr>
       <w:r>
         <w:rPr>
           <w:rFonts w:ascii="Times New Roman" w:hAnsi="Times New Roman" w:cs="Times New Roman"/>
@@ -2429,131 +2500,7 @@
           <w:sz w:val="24"/>
           <w:szCs w:val="24"/>
         </w:rPr>
-        <w:t xml:space="preserve"> protocolo usa banco, em conformidade com a Res. 738.</w:t>
-      </w:r>
-    </w:p>
-    <w:p>
-      <w:pPr>
-        <w:spacing w:after="120" w:line="360" w:lineRule="auto"/>
-        <w:contextualSpacing/>
-        <w:jc w:val="both"/>
-        <w:rPr>
-          <w:rFonts w:ascii="Times New Roman" w:hAnsi="Times New Roman" w:cs="Times New Roman"/>
-          <w:sz w:val="24"/>
-          <w:szCs w:val="24"/>
-        </w:rPr>
-      </w:pPr>
-      <w:r>
-        <w:rPr>
-          <w:rFonts w:ascii="Times New Roman" w:hAnsi="Times New Roman" w:cs="Times New Roman"/>
-          <w:sz w:val="24"/>
-          <w:szCs w:val="24"/>
-        </w:rPr>
-        <w:t>Eixo 3.b: 0 respostas de risco → Nível I. O eixo não eleva a classificação. Os outros cinco eixos definem o nível final segundo a regra padrão.</w:t>
-      </w:r>
-    </w:p>
-    <w:p>
-      <w:pPr>
-        <w:spacing w:after="120" w:line="360" w:lineRule="auto"/>
-        <w:contextualSpacing/>
-        <w:jc w:val="both"/>
-        <w:rPr>
-          <w:rFonts w:ascii="Times New Roman" w:hAnsi="Times New Roman" w:cs="Times New Roman"/>
-          <w:sz w:val="24"/>
-          <w:szCs w:val="24"/>
-        </w:rPr>
-      </w:pPr>
-      <w:r>
-        <w:rPr>
-          <w:rFonts w:ascii="Times New Roman" w:hAnsi="Times New Roman" w:cs="Times New Roman"/>
-          <w:b/>
-          <w:bCs/>
-          <w:sz w:val="24"/>
-          <w:szCs w:val="24"/>
-        </w:rPr>
-        <w:t>Cenário B</w:t>
-      </w:r>
-      <w:r>
-        <w:rPr>
-          <w:rFonts w:ascii="Times New Roman" w:hAnsi="Times New Roman" w:cs="Times New Roman"/>
-          <w:b/>
-          <w:bCs/>
-          <w:sz w:val="24"/>
-          <w:szCs w:val="24"/>
-        </w:rPr>
-        <w:t>:</w:t>
-      </w:r>
-      <w:r>
-        <w:rPr>
-          <w:rFonts w:ascii="Times New Roman" w:hAnsi="Times New Roman" w:cs="Times New Roman"/>
-          <w:b/>
-          <w:bCs/>
-          <w:sz w:val="24"/>
-          <w:szCs w:val="24"/>
-        </w:rPr>
-        <w:t xml:space="preserve"> protocolo usa banco, com 1 problema concreto.</w:t>
-      </w:r>
-    </w:p>
-    <w:p>
-      <w:pPr>
-        <w:spacing w:after="120" w:line="360" w:lineRule="auto"/>
-        <w:contextualSpacing/>
-        <w:jc w:val="both"/>
-        <w:rPr>
-          <w:rFonts w:ascii="Times New Roman" w:hAnsi="Times New Roman" w:cs="Times New Roman"/>
-          <w:sz w:val="24"/>
-          <w:szCs w:val="24"/>
-        </w:rPr>
-      </w:pPr>
-      <w:r>
-        <w:rPr>
-          <w:rFonts w:ascii="Times New Roman" w:hAnsi="Times New Roman" w:cs="Times New Roman"/>
-          <w:sz w:val="24"/>
-          <w:szCs w:val="24"/>
-        </w:rPr>
-        <w:t>Exemplo: dispensa de consentimento adotada sem justificativa adequada na perspectiva da Res. 738. Eixo 3.b: 1 resposta de risco → Nível III. Pela regra do máximo, o protocolo é classificado em pelo menos Nível III, ainda que os outros cinco eixos sejam todos Nível I. Um único problema no Eixo 3.b promove o protocolo dois níveis (do I direto ao III).</w:t>
-      </w:r>
-    </w:p>
-    <w:p>
-      <w:pPr>
-        <w:spacing w:after="120" w:line="360" w:lineRule="auto"/>
-        <w:contextualSpacing/>
-        <w:jc w:val="both"/>
-        <w:rPr>
-          <w:rFonts w:ascii="Times New Roman" w:hAnsi="Times New Roman" w:cs="Times New Roman"/>
-          <w:sz w:val="24"/>
-          <w:szCs w:val="24"/>
-        </w:rPr>
-      </w:pPr>
-      <w:r>
-        <w:rPr>
-          <w:rFonts w:ascii="Times New Roman" w:hAnsi="Times New Roman" w:cs="Times New Roman"/>
-          <w:b/>
-          <w:bCs/>
-          <w:sz w:val="24"/>
-          <w:szCs w:val="24"/>
-        </w:rPr>
-        <w:t>Cenário C</w:t>
-      </w:r>
-      <w:r>
-        <w:rPr>
-          <w:rFonts w:ascii="Times New Roman" w:hAnsi="Times New Roman" w:cs="Times New Roman"/>
-          <w:b/>
-          <w:bCs/>
-          <w:sz w:val="24"/>
-          <w:szCs w:val="24"/>
-        </w:rPr>
-        <w:t>:</w:t>
-      </w:r>
-      <w:r>
-        <w:rPr>
-          <w:rFonts w:ascii="Times New Roman" w:hAnsi="Times New Roman" w:cs="Times New Roman"/>
-          <w:b/>
-          <w:bCs/>
-          <w:sz w:val="24"/>
-          <w:szCs w:val="24"/>
-        </w:rPr>
-        <w:t xml:space="preserve"> protocolo usa banco, com 3 ou mais problemas.</w:t>
+        <w:t xml:space="preserve">Cenário C: protocolo usa banco, com 3 ou mais problemas.</w:t>
       </w:r>
     </w:p>
     <w:p>
@@ -2594,23 +2541,7 @@
           <w:sz w:val="24"/>
           <w:szCs w:val="24"/>
         </w:rPr>
-        <w:t>2.5 Crítica</w:t>
-      </w:r>
-      <w:r>
-        <w:rPr>
-          <w:rFonts w:ascii="Times New Roman" w:hAnsi="Times New Roman" w:cs="Times New Roman"/>
-          <w:sz w:val="24"/>
-          <w:szCs w:val="24"/>
-        </w:rPr>
-        <w:t>:</w:t>
-      </w:r>
-      <w:r>
-        <w:rPr>
-          <w:rFonts w:ascii="Times New Roman" w:hAnsi="Times New Roman" w:cs="Times New Roman"/>
-          <w:sz w:val="24"/>
-          <w:szCs w:val="24"/>
-        </w:rPr>
-        <w:t xml:space="preserve"> o que um leitor técnico pode levantar</w:t>
+        <w:t xml:space="preserve">2.5 Crítica: o que um leitor técnico pode levantar</w:t>
       </w:r>
     </w:p>
     <w:p>
@@ -2686,23 +2617,7 @@
           <w:sz w:val="24"/>
           <w:szCs w:val="24"/>
         </w:rPr>
-        <w:t>“Por que a elevação não é proporcional ao risco material observado?” Porque a MARIA, neste estágio, não dispõe de evidência empírica que permita calibrar de forma proporcional. Na ausência dessa evidência, preferiu-se errar para o lado da maior cautela</w:t>
-      </w:r>
-      <w:r>
-        <w:rPr>
-          <w:rFonts w:ascii="Times New Roman" w:hAnsi="Times New Roman" w:cs="Times New Roman"/>
-          <w:sz w:val="24"/>
-          <w:szCs w:val="24"/>
-        </w:rPr>
-        <w:t xml:space="preserve">, </w:t>
-      </w:r>
-      <w:r>
-        <w:rPr>
-          <w:rFonts w:ascii="Times New Roman" w:hAnsi="Times New Roman" w:cs="Times New Roman"/>
-          <w:sz w:val="24"/>
-          <w:szCs w:val="24"/>
-        </w:rPr>
-        <w:t>postura coerente com o restante das decisões metodológicas da matriz.</w:t>
+        <w:t xml:space="preserve">“Por que a elevação não é proporcional ao risco material observado?” Porque a MARIA, neste estágio, não dispõe de evidência empírica que permita calibrar de forma proporcional. Na ausência dessa evidência, preferiu-se errar para o lado da maior cautela, postura coerente com o restante das decisões metodológicas da matriz.</w:t>
       </w:r>
     </w:p>
     <w:p>
@@ -2786,23 +2701,7 @@
           <w:sz w:val="24"/>
           <w:szCs w:val="24"/>
         </w:rPr>
-        <w:t>A cláusula opera sobre duas questões do Bloco 4 (Decisão)</w:t>
-      </w:r>
-      <w:r>
-        <w:rPr>
-          <w:rFonts w:ascii="Times New Roman" w:hAnsi="Times New Roman" w:cs="Times New Roman"/>
-          <w:sz w:val="24"/>
-          <w:szCs w:val="24"/>
-        </w:rPr>
-        <w:t>,</w:t>
-      </w:r>
-      <w:r>
-        <w:rPr>
-          <w:rFonts w:ascii="Times New Roman" w:hAnsi="Times New Roman" w:cs="Times New Roman"/>
-          <w:sz w:val="24"/>
-          <w:szCs w:val="24"/>
-        </w:rPr>
-        <w:t xml:space="preserve"> o bloco que avalia o grau de autonomia decisória do sistema e a consequência de um erro, as perguntas mais críticas da matriz:</w:t>
+        <w:t xml:space="preserve">A cláusula opera sobre duas questões do Bloco 4 (Decisão), o bloco que avalia o grau de autonomia decisória do sistema e a consequência de um erro, as perguntas mais críticas da matriz:</w:t>
       </w:r>
     </w:p>
     <w:p>
@@ -2915,46 +2814,7 @@
           <w:sz w:val="24"/>
           <w:szCs w:val="24"/>
         </w:rPr>
-        <w:t xml:space="preserve">As duas condições capturadas por P4.1 e P4.2 </w:t>
-      </w:r>
-      <w:r>
-        <w:rPr>
-          <w:rFonts w:ascii="Times New Roman" w:hAnsi="Times New Roman" w:cs="Times New Roman"/>
-          <w:sz w:val="24"/>
-          <w:szCs w:val="24"/>
-        </w:rPr>
-        <w:t>(</w:t>
-      </w:r>
-      <w:r>
-        <w:rPr>
-          <w:rFonts w:ascii="Times New Roman" w:hAnsi="Times New Roman" w:cs="Times New Roman"/>
-          <w:sz w:val="24"/>
-          <w:szCs w:val="24"/>
-        </w:rPr>
-        <w:t>ausência de revisão humana sobre uma decisão que afeta diretamente o participante, e potencial de dano irreversível</w:t>
-      </w:r>
-      <w:r>
-        <w:rPr>
-          <w:rFonts w:ascii="Times New Roman" w:hAnsi="Times New Roman" w:cs="Times New Roman"/>
-          <w:sz w:val="24"/>
-          <w:szCs w:val="24"/>
-        </w:rPr>
-        <w:t>)</w:t>
-      </w:r>
-      <w:r>
-        <w:rPr>
-          <w:rFonts w:ascii="Times New Roman" w:hAnsi="Times New Roman" w:cs="Times New Roman"/>
-          <w:sz w:val="24"/>
-          <w:szCs w:val="24"/>
-        </w:rPr>
-        <w:t xml:space="preserve"> são, no entendimento que orientou a elaboração da matriz, eticamente inegociáveis. São exatamente o tipo de condição que um modelo puramente aditivo trataria mal: um protocolo poderia </w:t>
-      </w:r>
-      <w:r>
-        <w:rPr>
-          <w:rFonts w:ascii="Times New Roman" w:hAnsi="Times New Roman" w:cs="Times New Roman"/>
-          <w:sz w:val="24"/>
-          <w:szCs w:val="24"/>
-        </w:rPr>
+        <w:t xml:space="preserve">As duas condições capturadas por P4.1 e P4.2 (ausência de revisão humana sobre uma decisão que afeta diretamente o participante, e potencial de dano irreversível) são, no entendimento que orientou a elaboração da matriz, eticamente inegociáveis. São exatamente o tipo de condição que um modelo puramente aditivo trataria mal: um protocolo poderia </w:t>
         <w:lastRenderedPageBreak/>
         <w:t>acumular pontuação baixa nos demais blocos e, ainda assim, embutir um risco decisional grave que ficaria “diluído” no escore total. A cláusula impede essa diluição, tornando a presença da condição decisiva por si só.</w:t>
       </w:r>
@@ -3032,39 +2892,7 @@
           <w:sz w:val="24"/>
           <w:szCs w:val="24"/>
         </w:rPr>
-        <w:t>Vale contrastá-la com o Bloco 7 (Mitigação), o outro mecanismo que altera o escore. O Bloco 7 é bidirecional e opera dentro da soma: subtrai pontos quando há mitigação e os preserva quando não há, com piso de zero</w:t>
-      </w:r>
-      <w:r>
-        <w:rPr>
-          <w:rFonts w:ascii="Times New Roman" w:hAnsi="Times New Roman" w:cs="Times New Roman"/>
-          <w:sz w:val="24"/>
-          <w:szCs w:val="24"/>
-        </w:rPr>
-        <w:t>,</w:t>
-      </w:r>
-      <w:r>
-        <w:rPr>
-          <w:rFonts w:ascii="Times New Roman" w:hAnsi="Times New Roman" w:cs="Times New Roman"/>
-          <w:sz w:val="24"/>
-          <w:szCs w:val="24"/>
-        </w:rPr>
-        <w:t xml:space="preserve"> isto é, move o protocolo ao longo do gradiente, mas nunca o retira dele. A Cláusula de Prevalência Ética faz o oposto: não participa da soma, e sim a sobrescreve. Por consequência, nenhuma mitigação do Bloco 7 reduz um protocolo abaixo do Nível IV uma vez acionada a cláusula</w:t>
-      </w:r>
-      <w:r>
-        <w:rPr>
-          <w:rFonts w:ascii="Times New Roman" w:hAnsi="Times New Roman" w:cs="Times New Roman"/>
-          <w:sz w:val="24"/>
-          <w:szCs w:val="24"/>
-        </w:rPr>
-        <w:t>,</w:t>
-      </w:r>
-      <w:r>
-        <w:rPr>
-          <w:rFonts w:ascii="Times New Roman" w:hAnsi="Times New Roman" w:cs="Times New Roman"/>
-          <w:sz w:val="24"/>
-          <w:szCs w:val="24"/>
-        </w:rPr>
-        <w:t xml:space="preserve"> a salvaguarda ética prevalece sobre o crédito de mitigação.</w:t>
+        <w:t xml:space="preserve">Vale contrastá-la com o Bloco 7 (Mitigação), o outro mecanismo que altera o escore. O Bloco 7 é bidirecional e opera dentro da soma: subtrai pontos quando há mitigação e os preserva quando não há, com piso de zero, isto é, move o protocolo ao longo do gradiente, mas nunca o retira dele. A Cláusula de Prevalência Ética faz o oposto: não participa da soma, e sim a sobrescreve. Por consequência, nenhuma mitigação do Bloco 7 reduz um protocolo abaixo do Nível IV uma vez acionada a cláusula, a salvaguarda ética prevalece sobre o crédito de mitigação.</w:t>
       </w:r>
     </w:p>
     <w:p>
@@ -3838,23 +3666,7 @@
           <w:sz w:val="24"/>
           <w:szCs w:val="24"/>
         </w:rPr>
-        <w:t>3.5 Crítica</w:t>
-      </w:r>
-      <w:r>
-        <w:rPr>
-          <w:rFonts w:ascii="Times New Roman" w:hAnsi="Times New Roman" w:cs="Times New Roman"/>
-          <w:sz w:val="24"/>
-          <w:szCs w:val="24"/>
-        </w:rPr>
-        <w:t>:</w:t>
-      </w:r>
-      <w:r>
-        <w:rPr>
-          <w:rFonts w:ascii="Times New Roman" w:hAnsi="Times New Roman" w:cs="Times New Roman"/>
-          <w:sz w:val="24"/>
-          <w:szCs w:val="24"/>
-        </w:rPr>
-        <w:t xml:space="preserve"> o que um leitor técnico pode levantar</w:t>
+        <w:t xml:space="preserve">3.5 Crítica: o que um leitor técnico pode levantar</w:t>
       </w:r>
     </w:p>
     <w:p>
@@ -3904,23 +3716,7 @@
           <w:sz w:val="24"/>
           <w:szCs w:val="24"/>
         </w:rPr>
-        <w:t>“Isso não gera sobre-classificação?” Pode gerar, em algum percentual</w:t>
-      </w:r>
-      <w:r>
-        <w:rPr>
-          <w:rFonts w:ascii="Times New Roman" w:hAnsi="Times New Roman" w:cs="Times New Roman"/>
-          <w:sz w:val="24"/>
-          <w:szCs w:val="24"/>
-        </w:rPr>
-        <w:t>,</w:t>
-      </w:r>
-      <w:r>
-        <w:rPr>
-          <w:rFonts w:ascii="Times New Roman" w:hAnsi="Times New Roman" w:cs="Times New Roman"/>
-          <w:sz w:val="24"/>
-          <w:szCs w:val="24"/>
-        </w:rPr>
-        <w:t xml:space="preserve"> é o custo deliberado da precaução. A Frente 2 do Apêndice F (distribuição empírica nos níveis) é o instrumento para verificar com que frequência a cláusula é acionada e se a elevação se mostra desproporcional na casuística real.</w:t>
+        <w:t xml:space="preserve">“Isso não gera sobre-classificação?” Pode gerar, em algum percentual, é o custo deliberado da precaução. A Frente 2 do Apêndice F (distribuição empírica nos níveis) é o instrumento para verificar com que frequência a cláusula é acionada e se a elevação se mostra desproporcional na casuística real.</w:t>
       </w:r>
     </w:p>
     <w:p>
@@ -3966,7 +3762,7 @@
           <w:sz w:val="24"/>
           <w:szCs w:val="24"/>
         </w:rPr>
-        <w:t>4. Gatilho 3 Questões eliminatórias (modo Res. 738)</w:t>
+        <w:t>4. Gatilhos 3 e 4 Questões eliminatórias (cadeia de custódia e novo consentimento)</w:t>
       </w:r>
     </w:p>
     <w:p>
@@ -3987,7 +3783,7 @@
           <w:sz w:val="24"/>
           <w:szCs w:val="24"/>
         </w:rPr>
-        <w:t>O terceiro gatilho é de natureza distinta dos dois primeiros e, por isso, é apresentado apenas em parágrafo. No modo Res. 738, determinadas questões são eliminatórias: quando acionadas, não elevam o protocolo a um nível de risco mais alto. Elas o retiram do fluxo de classificação, atribuindo-lhe a saída categorial “não avaliável pela MARIA”. Essa saída não é um quinto nível nem um agravamento da soma; é uma recusa de classificação, que sinaliza que o protocolo exige análise individualizada do colegiado, fora do alcance do instrumento. É, nesse sentido, a salvaguarda mais radical dos três: enquanto o Gatilho 1 e o Gatilho 2 forçam a elevação para dentro da escala, a questão eliminatória sobrescreve a soma reconhecendo o limite da própria matriz. O acionamento remete o caso à deliberação do CEP, em coerência com o disclaimer da MARIA, que não substitui o julgamento do colegiado.</w:t>
+        <w:t>Os dois últimos gatilhos são de natureza distinta dos dois primeiros e, por isso, são apresentados em conjunto. Ambos são questões eliminatórias: quando acionadas, não elevam o protocolo a um nível de risco mais alto — retiram-no do fluxo de classificação, atribuindo-lhe a saída categorial “não avaliável pela MARIA”. Essa saída não é um quinto nível nem um agravamento da soma; é uma recusa de classificação, que sinaliza que o protocolo exige análise individualizada do colegiado, fora do alcance do instrumento. Os dois diferem quanto ao fundamento. O Gatilho 3 (cadeia de custódia, Res. CNS n.º 738/2024) dispara quando falta cadeia de custódia formalizada dos dados. O Gatilho 4 (novo consentimento, Lei n.º 14.874/2024 e LGPD) dispara em sistemas que mudam de comportamento durante o estudo — na Versão A quando 1.2 = Sim; na Versão B quando P2.2 = Sim — e o protocolo não apresenta plano de novo consentimento com limiar de mudança definido, procedimento e responsável; por ser exigência legal, a ausência desse plano não é compensável por pontos. Na Versão A corresponde à questão 2.10; na Versão B, à P2.8. São, nesse sentido, as salvaguardas mais radicais: enquanto os Gatilhos 1 e 2 forçam a elevação para dentro da escala, as questões eliminatórias sobrescrevem a contagem ou a soma reconhecendo o limite da própria matriz. O acionamento remete o caso à deliberação do CEP, em coerência com o disclaimer da MARIA, que não substitui o julgamento do colegiado.</w:t>
       </w:r>
     </w:p>
     <w:p>
@@ -4029,64 +3825,9 @@
           <w:sz w:val="24"/>
           <w:szCs w:val="24"/>
         </w:rPr>
-        <w:t xml:space="preserve">Os três gatilhos </w:t>
-      </w:r>
-      <w:r>
-        <w:rPr>
-          <w:rFonts w:ascii="Times New Roman" w:hAnsi="Times New Roman" w:cs="Times New Roman"/>
-          <w:sz w:val="24"/>
-          <w:szCs w:val="24"/>
-        </w:rPr>
-        <w:t>(</w:t>
-      </w:r>
-      <w:r>
-        <w:rPr>
-          <w:rFonts w:ascii="Times New Roman" w:hAnsi="Times New Roman" w:cs="Times New Roman"/>
-          <w:sz w:val="24"/>
-          <w:szCs w:val="24"/>
-        </w:rPr>
-        <w:t>a regra especial do Eixo 3.b, a Cláusula de Prevalência Ética e as questões eliminatórias</w:t>
-      </w:r>
-      <w:r>
-        <w:rPr>
-          <w:rFonts w:ascii="Times New Roman" w:hAnsi="Times New Roman" w:cs="Times New Roman"/>
-          <w:sz w:val="24"/>
-          <w:szCs w:val="24"/>
-        </w:rPr>
-        <w:t>)</w:t>
-      </w:r>
-      <w:r>
-        <w:rPr>
-          <w:rFonts w:ascii="Times New Roman" w:hAnsi="Times New Roman" w:cs="Times New Roman"/>
-          <w:sz w:val="24"/>
-          <w:szCs w:val="24"/>
-        </w:rPr>
-        <w:t xml:space="preserve"> materializam, em conjunto, a postura conservadora da MARIA. São decisões éticas embutidas na escala, não derivações estatísticas: cada uma identifica uma condição que não admite tratamento gradual e faz com que a sua presença prevaleça sobre a contagem (Versão A) ou a soma (Versão B). São assimetrias deliberadas, assumidas como tais, </w:t>
-      </w:r>
-      <w:r>
-        <w:rPr>
-          <w:rFonts w:ascii="Times New Roman" w:hAnsi="Times New Roman" w:cs="Times New Roman"/>
-          <w:sz w:val="24"/>
-          <w:szCs w:val="24"/>
-        </w:rPr>
+        <w:t xml:space="preserve">Os quatro gatilhos (a regra especial do Eixo 3.b, a Cláusula de Prevalência Ética, a eliminatória de cadeia de custódia e a diligência impeditiva de novo consentimento) materializam, em conjunto, a postura conservadora da MARIA. São decisões éticas embutidas na escala, não derivações estatísticas: cada uma identifica uma condição que não admite tratamento gradual e faz com que a sua presença prevaleça sobre a contagem (Versão A) ou a soma (Versão B). São assimetrias deliberadas, assumidas como tais, </w:t>
         <w:lastRenderedPageBreak/>
-        <w:t xml:space="preserve">que priorizam a precaução sobre a proporcionalidade fina </w:t>
-      </w:r>
-      <w:r>
-        <w:rPr>
-          <w:rFonts w:ascii="Times New Roman" w:hAnsi="Times New Roman" w:cs="Times New Roman"/>
-          <w:sz w:val="24"/>
-          <w:szCs w:val="24"/>
-        </w:rPr>
-        <w:t>e</w:t>
-      </w:r>
-      <w:r>
-        <w:rPr>
-          <w:rFonts w:ascii="Times New Roman" w:hAnsi="Times New Roman" w:cs="Times New Roman"/>
-          <w:sz w:val="24"/>
-          <w:szCs w:val="24"/>
-        </w:rPr>
-        <w:t xml:space="preserve"> escolha coerente com a ausência, neste estágio, de evidência empírica que permitisse uma calibração proporcional.</w:t>
+        <w:t xml:space="preserve">que priorizam a precaução sobre a proporcionalidade fina e escolha coerente com a ausência, neste estágio, de evidência empírica que permitisse uma calibração proporcional.</w:t>
       </w:r>
     </w:p>
     <w:p>
@@ -4107,15 +3848,7 @@
           <w:sz w:val="24"/>
           <w:szCs w:val="24"/>
         </w:rPr>
-        <w:t xml:space="preserve">A Frente 2 do Apêndice F (distribuição empírica nos quatro níveis, na Versão B) é o instrumento prospectivo desenhado para verificar, na casuística real dos CEPs, se esses gatilhos estão bem calibrados ou se produzem sobre-classificação que justifique ajuste. Eventuais sugestões do GT sobre essas regras serão consolidadas no fechamento do período de leitura, antes do envio do Guia à Editora MS. Observações e críticas técnicas podem ser encaminhadas, em qualquer momento, à </w:t>
-      </w:r>
-      <w:r>
-        <w:rPr>
-          <w:rFonts w:ascii="Times New Roman" w:hAnsi="Times New Roman" w:cs="Times New Roman"/>
-          <w:sz w:val="24"/>
-          <w:szCs w:val="24"/>
-        </w:rPr>
-        <w:t>CGREP (</w:t>
+        <w:t xml:space="preserve">A Frente 2 do Apêndice F (distribuição empírica nos quatro níveis, na Versão B) é o instrumento prospectivo desenhado para verificar, na casuística real dos CEPs, se esses gatilhos estão bem calibrados ou se produzem sobre-classificação que justifique ajuste. Eventuais sugestões do GT sobre essas regras serão consolidadas no fechamento do período de leitura, antes do envio do Guia à Editora MS. Observações e críticas técnicas podem ser encaminhadas, em qualquer momento, à CGREP (</w:t>
       </w:r>
       <w:hyperlink r:id="rId7" w:history="1">
         <w:r>

</xml_diff>